<commit_message>
Documentação: ADR-030, sanções da CGU no DOC-05, DOC-06, DOC-10, README, Wiki e CHANGELOG
</commit_message>
<xml_diff>
--- a/docs/DOC-05_Modelo_de_Dados.docx
+++ b/docs/DOC-05_Modelo_de_Dados.docx
@@ -267,7 +267,7 @@
                 <w:sz w:val="19"/>
                 <w:szCs w:val="19"/>
               </w:rPr>
-              <w:t xml:space="preserve">1.1</w:t>
+              <w:t xml:space="preserve">1.2</w:t>
             </w:r>
           </w:p>
         </w:tc>
@@ -326,7 +326,7 @@
                 <w:sz w:val="19"/>
                 <w:szCs w:val="19"/>
               </w:rPr>
-              <w:t xml:space="preserve">6 de outubro de 2026</w:t>
+              <w:t xml:space="preserve">16 de outubro de 2026</w:t>
             </w:r>
           </w:p>
         </w:tc>
@@ -385,7 +385,7 @@
                 <w:sz w:val="19"/>
                 <w:szCs w:val="19"/>
               </w:rPr>
-              <w:t xml:space="preserve">Atualizado com o bloco de fatos implementado na Fase 1 (ADR-016, ADR-017)</w:t>
+              <w:t xml:space="preserve">Atualizado com o bloco de fatos implementado na Fase 1 (ADR-016, ADR-017) e as sanções da CGU (ADR-030)</w:t>
             </w:r>
           </w:p>
         </w:tc>
@@ -11609,7 +11609,7 @@
           <w:i w:val="false"/>
           <w:iCs w:val="false"/>
         </w:rPr>
-        <w:t xml:space="preserve">Registro de sanção administrativa vigente, obtido dos cadastros federais.</w:t>
+        <w:t xml:space="preserve">Sanção ou impedimento num cadastro da CGU (CEIS, CNEP, CEPIM), como publicado, num retrato diário do cadastro (implementado na Fase 1, ADR-030).</w:t>
       </w:r>
     </w:p>
     <w:tbl>
@@ -11855,7 +11855,7 @@
                 <w:sz w:val="19"/>
                 <w:szCs w:val="19"/>
               </w:rPr>
-              <w:t xml:space="preserve">Identificador interno</w:t>
+              <w:t xml:space="preserve">Identificador interno: cadastro + código da sanção (no CEPIM, CNPJ + convênio)</w:t>
             </w:r>
           </w:p>
         </w:tc>
@@ -11887,7 +11887,7 @@
                 <w:sz w:val="19"/>
                 <w:szCs w:val="19"/>
               </w:rPr>
-              <w:t xml:space="preserve">fornecedor_id</w:t>
+              <w:t xml:space="preserve">cadastro</w:t>
             </w:r>
           </w:p>
         </w:tc>
@@ -11914,7 +11914,7 @@
                 <w:sz w:val="19"/>
                 <w:szCs w:val="19"/>
               </w:rPr>
-              <w:t xml:space="preserve">UUID</w:t>
+              <w:t xml:space="preserve">ENUM</w:t>
             </w:r>
           </w:p>
         </w:tc>
@@ -11968,7 +11968,7 @@
                 <w:sz w:val="19"/>
                 <w:szCs w:val="19"/>
               </w:rPr>
-              <w:t xml:space="preserve">Sancionado</w:t>
+              <w:t xml:space="preserve">CEIS, CNEP, CEPIM</w:t>
             </w:r>
           </w:p>
         </w:tc>
@@ -12000,7 +12000,7 @@
                 <w:sz w:val="19"/>
                 <w:szCs w:val="19"/>
               </w:rPr>
-              <w:t xml:space="preserve">cadastro</w:t>
+              <w:t xml:space="preserve">data_referencia</w:t>
             </w:r>
           </w:p>
         </w:tc>
@@ -12027,7 +12027,7 @@
                 <w:sz w:val="19"/>
                 <w:szCs w:val="19"/>
               </w:rPr>
-              <w:t xml:space="preserve">ENUM</w:t>
+              <w:t xml:space="preserve">DATE</w:t>
             </w:r>
           </w:p>
         </w:tc>
@@ -12054,7 +12054,7 @@
                 <w:sz w:val="19"/>
                 <w:szCs w:val="19"/>
               </w:rPr>
-              <w:t xml:space="preserve">Sim</w:t>
+              <w:t xml:space="preserve">Não</w:t>
             </w:r>
           </w:p>
         </w:tc>
@@ -12081,7 +12081,7 @@
                 <w:sz w:val="19"/>
                 <w:szCs w:val="19"/>
               </w:rPr>
-              <w:t xml:space="preserve">CEIS, CNEP, CEPIM</w:t>
+              <w:t xml:space="preserve">Dia do retrato do cadastro; o que está no cadastro hoje é o retrato mais recente</w:t>
             </w:r>
           </w:p>
         </w:tc>
@@ -12113,7 +12113,7 @@
                 <w:sz w:val="19"/>
                 <w:szCs w:val="19"/>
               </w:rPr>
-              <w:t xml:space="preserve">tipo</w:t>
+              <w:t xml:space="preserve">fornecedor_id</w:t>
             </w:r>
           </w:p>
         </w:tc>
@@ -12140,7 +12140,7 @@
                 <w:sz w:val="19"/>
                 <w:szCs w:val="19"/>
               </w:rPr>
-              <w:t xml:space="preserve">TEXT</w:t>
+              <w:t xml:space="preserve">UUID</w:t>
             </w:r>
           </w:p>
         </w:tc>
@@ -12167,7 +12167,7 @@
                 <w:sz w:val="19"/>
                 <w:szCs w:val="19"/>
               </w:rPr>
-              <w:t xml:space="preserve">Sim</w:t>
+              <w:t xml:space="preserve">Não</w:t>
             </w:r>
           </w:p>
         </w:tc>
@@ -12194,7 +12194,7 @@
                 <w:sz w:val="19"/>
                 <w:szCs w:val="19"/>
               </w:rPr>
-              <w:t xml:space="preserve">Tipo de sanção conforme o cadastro (P)</w:t>
+              <w:t xml:space="preserve">O mesmo id do fornecedor no PNCP (CNPJ; CPF mascarado mais nome)</w:t>
             </w:r>
           </w:p>
         </w:tc>
@@ -12226,7 +12226,7 @@
                 <w:sz w:val="19"/>
                 <w:szCs w:val="19"/>
               </w:rPr>
-              <w:t xml:space="preserve">orgao_sancionador</w:t>
+              <w:t xml:space="preserve">documento</w:t>
             </w:r>
           </w:p>
         </w:tc>
@@ -12307,7 +12307,7 @@
                 <w:sz w:val="19"/>
                 <w:szCs w:val="19"/>
               </w:rPr>
-              <w:t xml:space="preserve">Órgão que aplicou (P)</w:t>
+              <w:t xml:space="preserve">CNPJ inteiro; CPF sempre mascarado (S)</w:t>
             </w:r>
           </w:p>
         </w:tc>
@@ -12339,7 +12339,7 @@
                 <w:sz w:val="19"/>
                 <w:szCs w:val="19"/>
               </w:rPr>
-              <w:t xml:space="preserve">data_inicio</w:t>
+              <w:t xml:space="preserve">tipo_pessoa, nome, razao_social_receita</w:t>
             </w:r>
           </w:p>
         </w:tc>
@@ -12366,7 +12366,7 @@
                 <w:sz w:val="19"/>
                 <w:szCs w:val="19"/>
               </w:rPr>
-              <w:t xml:space="preserve">DATE</w:t>
+              <w:t xml:space="preserve">TEXT</w:t>
             </w:r>
           </w:p>
         </w:tc>
@@ -12393,7 +12393,7 @@
                 <w:sz w:val="19"/>
                 <w:szCs w:val="19"/>
               </w:rPr>
-              <w:t xml:space="preserve">Sim</w:t>
+              <w:t xml:space="preserve">Não</w:t>
             </w:r>
           </w:p>
         </w:tc>
@@ -12420,7 +12420,7 @@
                 <w:sz w:val="19"/>
                 <w:szCs w:val="19"/>
               </w:rPr>
-              <w:t xml:space="preserve">Início da vigência; essencial para avaliar a data do contrato</w:t>
+              <w:t xml:space="preserve">Como publicados; razão social só de pessoa jurídica (P)</w:t>
             </w:r>
           </w:p>
         </w:tc>
@@ -12452,6 +12452,345 @@
                 <w:sz w:val="19"/>
                 <w:szCs w:val="19"/>
               </w:rPr>
+              <w:t xml:space="preserve">categoria</w:t>
+            </w:r>
+          </w:p>
+        </w:tc>
+        <w:tc>
+          <w:tcPr>
+            <w:tcW w:type="dxa" w:w="1300"/>
+            <w:shd w:fill="FFFFFF" w:val="clear"/>
+            <w:tcMar>
+              <w:top w:type="dxa" w:w="70"/>
+              <w:left w:type="dxa" w:w="110"/>
+              <w:bottom w:type="dxa" w:w="70"/>
+              <w:right w:type="dxa" w:w="110"/>
+            </w:tcMar>
+            <w:vAlign w:val="center"/>
+          </w:tcPr>
+          <w:p>
+            <w:pPr>
+              <w:spacing w:after="0"/>
+            </w:pPr>
+            <w:r>
+              <w:rPr>
+                <w:b w:val="false"/>
+                <w:bCs w:val="false"/>
+                <w:sz w:val="19"/>
+                <w:szCs w:val="19"/>
+              </w:rPr>
+              <w:t xml:space="preserve">TEXT</w:t>
+            </w:r>
+          </w:p>
+        </w:tc>
+        <w:tc>
+          <w:tcPr>
+            <w:tcW w:type="dxa" w:w="900"/>
+            <w:shd w:fill="FFFFFF" w:val="clear"/>
+            <w:tcMar>
+              <w:top w:type="dxa" w:w="70"/>
+              <w:left w:type="dxa" w:w="110"/>
+              <w:bottom w:type="dxa" w:w="70"/>
+              <w:right w:type="dxa" w:w="110"/>
+            </w:tcMar>
+            <w:vAlign w:val="center"/>
+          </w:tcPr>
+          <w:p>
+            <w:pPr>
+              <w:spacing w:after="0"/>
+            </w:pPr>
+            <w:r>
+              <w:rPr>
+                <w:b w:val="false"/>
+                <w:bCs w:val="false"/>
+                <w:sz w:val="19"/>
+                <w:szCs w:val="19"/>
+              </w:rPr>
+              <w:t xml:space="preserve">Não</w:t>
+            </w:r>
+          </w:p>
+        </w:tc>
+        <w:tc>
+          <w:tcPr>
+            <w:tcW w:type="dxa" w:w="5300"/>
+            <w:shd w:fill="FFFFFF" w:val="clear"/>
+            <w:tcMar>
+              <w:top w:type="dxa" w:w="70"/>
+              <w:left w:type="dxa" w:w="110"/>
+              <w:bottom w:type="dxa" w:w="70"/>
+              <w:right w:type="dxa" w:w="110"/>
+            </w:tcMar>
+            <w:vAlign w:val="center"/>
+          </w:tcPr>
+          <w:p>
+            <w:pPr>
+              <w:spacing w:after="0"/>
+            </w:pPr>
+            <w:r>
+              <w:rPr>
+                <w:b w:val="false"/>
+                <w:bCs w:val="false"/>
+                <w:sz w:val="19"/>
+                <w:szCs w:val="19"/>
+              </w:rPr>
+              <w:t xml:space="preserve">Categoria da sanção; no CEPIM, o motivo do impedimento (P)</w:t>
+            </w:r>
+          </w:p>
+        </w:tc>
+      </w:tr>
+      <w:tr>
+        <w:trPr>
+          <w:cantSplit/>
+        </w:trPr>
+        <w:tc>
+          <w:tcPr>
+            <w:tcW w:type="dxa" w:w="2100"/>
+            <w:shd w:fill="F2F2F2" w:val="clear"/>
+            <w:tcMar>
+              <w:top w:type="dxa" w:w="70"/>
+              <w:left w:type="dxa" w:w="110"/>
+              <w:bottom w:type="dxa" w:w="70"/>
+              <w:right w:type="dxa" w:w="110"/>
+            </w:tcMar>
+            <w:vAlign w:val="center"/>
+          </w:tcPr>
+          <w:p>
+            <w:pPr>
+              <w:spacing w:after="0"/>
+            </w:pPr>
+            <w:r>
+              <w:rPr>
+                <w:b w:val="false"/>
+                <w:bCs w:val="false"/>
+                <w:sz w:val="19"/>
+                <w:szCs w:val="19"/>
+              </w:rPr>
+              <w:t xml:space="preserve">numero_processo, numero_convenio, valor_multa</w:t>
+            </w:r>
+          </w:p>
+        </w:tc>
+        <w:tc>
+          <w:tcPr>
+            <w:tcW w:type="dxa" w:w="1300"/>
+            <w:shd w:fill="F2F2F2" w:val="clear"/>
+            <w:tcMar>
+              <w:top w:type="dxa" w:w="70"/>
+              <w:left w:type="dxa" w:w="110"/>
+              <w:bottom w:type="dxa" w:w="70"/>
+              <w:right w:type="dxa" w:w="110"/>
+            </w:tcMar>
+            <w:vAlign w:val="center"/>
+          </w:tcPr>
+          <w:p>
+            <w:pPr>
+              <w:spacing w:after="0"/>
+            </w:pPr>
+            <w:r>
+              <w:rPr>
+                <w:b w:val="false"/>
+                <w:bCs w:val="false"/>
+                <w:sz w:val="19"/>
+                <w:szCs w:val="19"/>
+              </w:rPr>
+              <w:t xml:space="preserve">TEXT, NUMERIC</w:t>
+            </w:r>
+          </w:p>
+        </w:tc>
+        <w:tc>
+          <w:tcPr>
+            <w:tcW w:type="dxa" w:w="900"/>
+            <w:shd w:fill="F2F2F2" w:val="clear"/>
+            <w:tcMar>
+              <w:top w:type="dxa" w:w="70"/>
+              <w:left w:type="dxa" w:w="110"/>
+              <w:bottom w:type="dxa" w:w="70"/>
+              <w:right w:type="dxa" w:w="110"/>
+            </w:tcMar>
+            <w:vAlign w:val="center"/>
+          </w:tcPr>
+          <w:p>
+            <w:pPr>
+              <w:spacing w:after="0"/>
+            </w:pPr>
+            <w:r>
+              <w:rPr>
+                <w:b w:val="false"/>
+                <w:bCs w:val="false"/>
+                <w:sz w:val="19"/>
+                <w:szCs w:val="19"/>
+              </w:rPr>
+              <w:t xml:space="preserve">Não</w:t>
+            </w:r>
+          </w:p>
+        </w:tc>
+        <w:tc>
+          <w:tcPr>
+            <w:tcW w:type="dxa" w:w="5300"/>
+            <w:shd w:fill="F2F2F2" w:val="clear"/>
+            <w:tcMar>
+              <w:top w:type="dxa" w:w="70"/>
+              <w:left w:type="dxa" w:w="110"/>
+              <w:bottom w:type="dxa" w:w="70"/>
+              <w:right w:type="dxa" w:w="110"/>
+            </w:tcMar>
+            <w:vAlign w:val="center"/>
+          </w:tcPr>
+          <w:p>
+            <w:pPr>
+              <w:spacing w:after="0"/>
+            </w:pPr>
+            <w:r>
+              <w:rPr>
+                <w:b w:val="false"/>
+                <w:bCs w:val="false"/>
+                <w:sz w:val="19"/>
+                <w:szCs w:val="19"/>
+              </w:rPr>
+              <w:t xml:space="preserve">Processo; convênio (CEPIM); multa (CNEP) (P)</w:t>
+            </w:r>
+          </w:p>
+        </w:tc>
+      </w:tr>
+      <w:tr>
+        <w:trPr>
+          <w:cantSplit/>
+        </w:trPr>
+        <w:tc>
+          <w:tcPr>
+            <w:tcW w:type="dxa" w:w="2100"/>
+            <w:shd w:fill="FFFFFF" w:val="clear"/>
+            <w:tcMar>
+              <w:top w:type="dxa" w:w="70"/>
+              <w:left w:type="dxa" w:w="110"/>
+              <w:bottom w:type="dxa" w:w="70"/>
+              <w:right w:type="dxa" w:w="110"/>
+            </w:tcMar>
+            <w:vAlign w:val="center"/>
+          </w:tcPr>
+          <w:p>
+            <w:pPr>
+              <w:spacing w:after="0"/>
+            </w:pPr>
+            <w:r>
+              <w:rPr>
+                <w:b w:val="false"/>
+                <w:bCs w:val="false"/>
+                <w:sz w:val="19"/>
+                <w:szCs w:val="19"/>
+              </w:rPr>
+              <w:t xml:space="preserve">data_inicio</w:t>
+            </w:r>
+          </w:p>
+        </w:tc>
+        <w:tc>
+          <w:tcPr>
+            <w:tcW w:type="dxa" w:w="1300"/>
+            <w:shd w:fill="FFFFFF" w:val="clear"/>
+            <w:tcMar>
+              <w:top w:type="dxa" w:w="70"/>
+              <w:left w:type="dxa" w:w="110"/>
+              <w:bottom w:type="dxa" w:w="70"/>
+              <w:right w:type="dxa" w:w="110"/>
+            </w:tcMar>
+            <w:vAlign w:val="center"/>
+          </w:tcPr>
+          <w:p>
+            <w:pPr>
+              <w:spacing w:after="0"/>
+            </w:pPr>
+            <w:r>
+              <w:rPr>
+                <w:b w:val="false"/>
+                <w:bCs w:val="false"/>
+                <w:sz w:val="19"/>
+                <w:szCs w:val="19"/>
+              </w:rPr>
+              <w:t xml:space="preserve">DATE</w:t>
+            </w:r>
+          </w:p>
+        </w:tc>
+        <w:tc>
+          <w:tcPr>
+            <w:tcW w:type="dxa" w:w="900"/>
+            <w:shd w:fill="FFFFFF" w:val="clear"/>
+            <w:tcMar>
+              <w:top w:type="dxa" w:w="70"/>
+              <w:left w:type="dxa" w:w="110"/>
+              <w:bottom w:type="dxa" w:w="70"/>
+              <w:right w:type="dxa" w:w="110"/>
+            </w:tcMar>
+            <w:vAlign w:val="center"/>
+          </w:tcPr>
+          <w:p>
+            <w:pPr>
+              <w:spacing w:after="0"/>
+            </w:pPr>
+            <w:r>
+              <w:rPr>
+                <w:b w:val="false"/>
+                <w:bCs w:val="false"/>
+                <w:sz w:val="19"/>
+                <w:szCs w:val="19"/>
+              </w:rPr>
+              <w:t xml:space="preserve">Não</w:t>
+            </w:r>
+          </w:p>
+        </w:tc>
+        <w:tc>
+          <w:tcPr>
+            <w:tcW w:type="dxa" w:w="5300"/>
+            <w:shd w:fill="FFFFFF" w:val="clear"/>
+            <w:tcMar>
+              <w:top w:type="dxa" w:w="70"/>
+              <w:left w:type="dxa" w:w="110"/>
+              <w:bottom w:type="dxa" w:w="70"/>
+              <w:right w:type="dxa" w:w="110"/>
+            </w:tcMar>
+            <w:vAlign w:val="center"/>
+          </w:tcPr>
+          <w:p>
+            <w:pPr>
+              <w:spacing w:after="0"/>
+            </w:pPr>
+            <w:r>
+              <w:rPr>
+                <w:b w:val="false"/>
+                <w:bCs w:val="false"/>
+                <w:sz w:val="19"/>
+                <w:szCs w:val="19"/>
+              </w:rPr>
+              <w:t xml:space="preserve">Início da sanção; obrigatório no CEIS e no CNEP, ausente no CEPIM</w:t>
+            </w:r>
+          </w:p>
+        </w:tc>
+      </w:tr>
+      <w:tr>
+        <w:trPr>
+          <w:cantSplit/>
+        </w:trPr>
+        <w:tc>
+          <w:tcPr>
+            <w:tcW w:type="dxa" w:w="2100"/>
+            <w:shd w:fill="F2F2F2" w:val="clear"/>
+            <w:tcMar>
+              <w:top w:type="dxa" w:w="70"/>
+              <w:left w:type="dxa" w:w="110"/>
+              <w:bottom w:type="dxa" w:w="70"/>
+              <w:right w:type="dxa" w:w="110"/>
+            </w:tcMar>
+            <w:vAlign w:val="center"/>
+          </w:tcPr>
+          <w:p>
+            <w:pPr>
+              <w:spacing w:after="0"/>
+            </w:pPr>
+            <w:r>
+              <w:rPr>
+                <w:b w:val="false"/>
+                <w:bCs w:val="false"/>
+                <w:sz w:val="19"/>
+                <w:szCs w:val="19"/>
+              </w:rPr>
               <w:t xml:space="preserve">data_fim</w:t>
             </w:r>
           </w:p>
@@ -12459,7 +12798,7 @@
         <w:tc>
           <w:tcPr>
             <w:tcW w:type="dxa" w:w="1300"/>
-            <w:shd w:fill="FFFFFF" w:val="clear"/>
+            <w:shd w:fill="F2F2F2" w:val="clear"/>
             <w:tcMar>
               <w:top w:type="dxa" w:w="70"/>
               <w:left w:type="dxa" w:w="110"/>
@@ -12486,7 +12825,7 @@
         <w:tc>
           <w:tcPr>
             <w:tcW w:type="dxa" w:w="900"/>
-            <w:shd w:fill="FFFFFF" w:val="clear"/>
+            <w:shd w:fill="F2F2F2" w:val="clear"/>
             <w:tcMar>
               <w:top w:type="dxa" w:w="70"/>
               <w:left w:type="dxa" w:w="110"/>
@@ -12513,27 +12852,366 @@
         <w:tc>
           <w:tcPr>
             <w:tcW w:type="dxa" w:w="5300"/>
-            <w:shd w:fill="FFFFFF" w:val="clear"/>
-            <w:tcMar>
-              <w:top w:type="dxa" w:w="70"/>
-              <w:left w:type="dxa" w:w="110"/>
-              <w:bottom w:type="dxa" w:w="70"/>
-              <w:right w:type="dxa" w:w="110"/>
-            </w:tcMar>
-            <w:vAlign w:val="center"/>
-          </w:tcPr>
-          <w:p>
-            <w:pPr>
-              <w:spacing w:after="0"/>
-            </w:pPr>
-            <w:r>
-              <w:rPr>
-                <w:b w:val="false"/>
-                <w:bCs w:val="false"/>
-                <w:sz w:val="19"/>
-                <w:szCs w:val="19"/>
-              </w:rPr>
-              <w:t xml:space="preserve">Fim da vigência</w:t>
+            <w:shd w:fill="F2F2F2" w:val="clear"/>
+            <w:tcMar>
+              <w:top w:type="dxa" w:w="70"/>
+              <w:left w:type="dxa" w:w="110"/>
+              <w:bottom w:type="dxa" w:w="70"/>
+              <w:right w:type="dxa" w:w="110"/>
+            </w:tcMar>
+            <w:vAlign w:val="center"/>
+          </w:tcPr>
+          <w:p>
+            <w:pPr>
+              <w:spacing w:after="0"/>
+            </w:pPr>
+            <w:r>
+              <w:rPr>
+                <w:b w:val="false"/>
+                <w:bCs w:val="false"/>
+                <w:sz w:val="19"/>
+                <w:szCs w:val="19"/>
+              </w:rPr>
+              <w:t xml:space="preserve">Fim da sanção; nulo quando sem prazo determinado</w:t>
+            </w:r>
+          </w:p>
+        </w:tc>
+      </w:tr>
+      <w:tr>
+        <w:trPr>
+          <w:cantSplit/>
+        </w:trPr>
+        <w:tc>
+          <w:tcPr>
+            <w:tcW w:type="dxa" w:w="2100"/>
+            <w:shd w:fill="FFFFFF" w:val="clear"/>
+            <w:tcMar>
+              <w:top w:type="dxa" w:w="70"/>
+              <w:left w:type="dxa" w:w="110"/>
+              <w:bottom w:type="dxa" w:w="70"/>
+              <w:right w:type="dxa" w:w="110"/>
+            </w:tcMar>
+            <w:vAlign w:val="center"/>
+          </w:tcPr>
+          <w:p>
+            <w:pPr>
+              <w:spacing w:after="0"/>
+            </w:pPr>
+            <w:r>
+              <w:rPr>
+                <w:b w:val="false"/>
+                <w:bCs w:val="false"/>
+                <w:sz w:val="19"/>
+                <w:szCs w:val="19"/>
+              </w:rPr>
+              <w:t xml:space="preserve">data_publicacao, data_transito_julgado, data_origem_informacao</w:t>
+            </w:r>
+          </w:p>
+        </w:tc>
+        <w:tc>
+          <w:tcPr>
+            <w:tcW w:type="dxa" w:w="1300"/>
+            <w:shd w:fill="FFFFFF" w:val="clear"/>
+            <w:tcMar>
+              <w:top w:type="dxa" w:w="70"/>
+              <w:left w:type="dxa" w:w="110"/>
+              <w:bottom w:type="dxa" w:w="70"/>
+              <w:right w:type="dxa" w:w="110"/>
+            </w:tcMar>
+            <w:vAlign w:val="center"/>
+          </w:tcPr>
+          <w:p>
+            <w:pPr>
+              <w:spacing w:after="0"/>
+            </w:pPr>
+            <w:r>
+              <w:rPr>
+                <w:b w:val="false"/>
+                <w:bCs w:val="false"/>
+                <w:sz w:val="19"/>
+                <w:szCs w:val="19"/>
+              </w:rPr>
+              <w:t xml:space="preserve">DATE</w:t>
+            </w:r>
+          </w:p>
+        </w:tc>
+        <w:tc>
+          <w:tcPr>
+            <w:tcW w:type="dxa" w:w="900"/>
+            <w:shd w:fill="FFFFFF" w:val="clear"/>
+            <w:tcMar>
+              <w:top w:type="dxa" w:w="70"/>
+              <w:left w:type="dxa" w:w="110"/>
+              <w:bottom w:type="dxa" w:w="70"/>
+              <w:right w:type="dxa" w:w="110"/>
+            </w:tcMar>
+            <w:vAlign w:val="center"/>
+          </w:tcPr>
+          <w:p>
+            <w:pPr>
+              <w:spacing w:after="0"/>
+            </w:pPr>
+            <w:r>
+              <w:rPr>
+                <w:b w:val="false"/>
+                <w:bCs w:val="false"/>
+                <w:sz w:val="19"/>
+                <w:szCs w:val="19"/>
+              </w:rPr>
+              <w:t xml:space="preserve">Não</w:t>
+            </w:r>
+          </w:p>
+        </w:tc>
+        <w:tc>
+          <w:tcPr>
+            <w:tcW w:type="dxa" w:w="5300"/>
+            <w:shd w:fill="FFFFFF" w:val="clear"/>
+            <w:tcMar>
+              <w:top w:type="dxa" w:w="70"/>
+              <w:left w:type="dxa" w:w="110"/>
+              <w:bottom w:type="dxa" w:w="70"/>
+              <w:right w:type="dxa" w:w="110"/>
+            </w:tcMar>
+            <w:vAlign w:val="center"/>
+          </w:tcPr>
+          <w:p>
+            <w:pPr>
+              <w:spacing w:after="0"/>
+            </w:pPr>
+            <w:r>
+              <w:rPr>
+                <w:b w:val="false"/>
+                <w:bCs w:val="false"/>
+                <w:sz w:val="19"/>
+                <w:szCs w:val="19"/>
+              </w:rPr>
+              <w:t xml:space="preserve">Datas publicadas pela CGU (P)</w:t>
+            </w:r>
+          </w:p>
+        </w:tc>
+      </w:tr>
+      <w:tr>
+        <w:trPr>
+          <w:cantSplit/>
+        </w:trPr>
+        <w:tc>
+          <w:tcPr>
+            <w:tcW w:type="dxa" w:w="2100"/>
+            <w:shd w:fill="F2F2F2" w:val="clear"/>
+            <w:tcMar>
+              <w:top w:type="dxa" w:w="70"/>
+              <w:left w:type="dxa" w:w="110"/>
+              <w:bottom w:type="dxa" w:w="70"/>
+              <w:right w:type="dxa" w:w="110"/>
+            </w:tcMar>
+            <w:vAlign w:val="center"/>
+          </w:tcPr>
+          <w:p>
+            <w:pPr>
+              <w:spacing w:after="0"/>
+            </w:pPr>
+            <w:r>
+              <w:rPr>
+                <w:b w:val="false"/>
+                <w:bCs w:val="false"/>
+                <w:sz w:val="19"/>
+                <w:szCs w:val="19"/>
+              </w:rPr>
+              <w:t xml:space="preserve">abrangencia, orgao_sancionador, uf_orgao_sancionador, esfera_orgao_sancionador</w:t>
+            </w:r>
+          </w:p>
+        </w:tc>
+        <w:tc>
+          <w:tcPr>
+            <w:tcW w:type="dxa" w:w="1300"/>
+            <w:shd w:fill="F2F2F2" w:val="clear"/>
+            <w:tcMar>
+              <w:top w:type="dxa" w:w="70"/>
+              <w:left w:type="dxa" w:w="110"/>
+              <w:bottom w:type="dxa" w:w="70"/>
+              <w:right w:type="dxa" w:w="110"/>
+            </w:tcMar>
+            <w:vAlign w:val="center"/>
+          </w:tcPr>
+          <w:p>
+            <w:pPr>
+              <w:spacing w:after="0"/>
+            </w:pPr>
+            <w:r>
+              <w:rPr>
+                <w:b w:val="false"/>
+                <w:bCs w:val="false"/>
+                <w:sz w:val="19"/>
+                <w:szCs w:val="19"/>
+              </w:rPr>
+              <w:t xml:space="preserve">TEXT, ENUM</w:t>
+            </w:r>
+          </w:p>
+        </w:tc>
+        <w:tc>
+          <w:tcPr>
+            <w:tcW w:type="dxa" w:w="900"/>
+            <w:shd w:fill="F2F2F2" w:val="clear"/>
+            <w:tcMar>
+              <w:top w:type="dxa" w:w="70"/>
+              <w:left w:type="dxa" w:w="110"/>
+              <w:bottom w:type="dxa" w:w="70"/>
+              <w:right w:type="dxa" w:w="110"/>
+            </w:tcMar>
+            <w:vAlign w:val="center"/>
+          </w:tcPr>
+          <w:p>
+            <w:pPr>
+              <w:spacing w:after="0"/>
+            </w:pPr>
+            <w:r>
+              <w:rPr>
+                <w:b w:val="false"/>
+                <w:bCs w:val="false"/>
+                <w:sz w:val="19"/>
+                <w:szCs w:val="19"/>
+              </w:rPr>
+              <w:t xml:space="preserve">Não</w:t>
+            </w:r>
+          </w:p>
+        </w:tc>
+        <w:tc>
+          <w:tcPr>
+            <w:tcW w:type="dxa" w:w="5300"/>
+            <w:shd w:fill="F2F2F2" w:val="clear"/>
+            <w:tcMar>
+              <w:top w:type="dxa" w:w="70"/>
+              <w:left w:type="dxa" w:w="110"/>
+              <w:bottom w:type="dxa" w:w="70"/>
+              <w:right w:type="dxa" w:w="110"/>
+            </w:tcMar>
+            <w:vAlign w:val="center"/>
+          </w:tcPr>
+          <w:p>
+            <w:pPr>
+              <w:spacing w:after="0"/>
+            </w:pPr>
+            <w:r>
+              <w:rPr>
+                <w:b w:val="false"/>
+                <w:bCs w:val="false"/>
+                <w:sz w:val="19"/>
+                <w:szCs w:val="19"/>
+              </w:rPr>
+              <w:t xml:space="preserve">Alcance da sanção e quem a aplicou; base da regra J-01 (P)</w:t>
+            </w:r>
+          </w:p>
+        </w:tc>
+      </w:tr>
+      <w:tr>
+        <w:trPr>
+          <w:cantSplit/>
+        </w:trPr>
+        <w:tc>
+          <w:tcPr>
+            <w:tcW w:type="dxa" w:w="2100"/>
+            <w:shd w:fill="FFFFFF" w:val="clear"/>
+            <w:tcMar>
+              <w:top w:type="dxa" w:w="70"/>
+              <w:left w:type="dxa" w:w="110"/>
+              <w:bottom w:type="dxa" w:w="70"/>
+              <w:right w:type="dxa" w:w="110"/>
+            </w:tcMar>
+            <w:vAlign w:val="center"/>
+          </w:tcPr>
+          <w:p>
+            <w:pPr>
+              <w:spacing w:after="0"/>
+            </w:pPr>
+            <w:r>
+              <w:rPr>
+                <w:b w:val="false"/>
+                <w:bCs w:val="false"/>
+                <w:sz w:val="19"/>
+                <w:szCs w:val="19"/>
+              </w:rPr>
+              <w:t xml:space="preserve">fundamentacao_legal, origem_informacao, meio_publicacao</w:t>
+            </w:r>
+          </w:p>
+        </w:tc>
+        <w:tc>
+          <w:tcPr>
+            <w:tcW w:type="dxa" w:w="1300"/>
+            <w:shd w:fill="FFFFFF" w:val="clear"/>
+            <w:tcMar>
+              <w:top w:type="dxa" w:w="70"/>
+              <w:left w:type="dxa" w:w="110"/>
+              <w:bottom w:type="dxa" w:w="70"/>
+              <w:right w:type="dxa" w:w="110"/>
+            </w:tcMar>
+            <w:vAlign w:val="center"/>
+          </w:tcPr>
+          <w:p>
+            <w:pPr>
+              <w:spacing w:after="0"/>
+            </w:pPr>
+            <w:r>
+              <w:rPr>
+                <w:b w:val="false"/>
+                <w:bCs w:val="false"/>
+                <w:sz w:val="19"/>
+                <w:szCs w:val="19"/>
+              </w:rPr>
+              <w:t xml:space="preserve">TEXT</w:t>
+            </w:r>
+          </w:p>
+        </w:tc>
+        <w:tc>
+          <w:tcPr>
+            <w:tcW w:type="dxa" w:w="900"/>
+            <w:shd w:fill="FFFFFF" w:val="clear"/>
+            <w:tcMar>
+              <w:top w:type="dxa" w:w="70"/>
+              <w:left w:type="dxa" w:w="110"/>
+              <w:bottom w:type="dxa" w:w="70"/>
+              <w:right w:type="dxa" w:w="110"/>
+            </w:tcMar>
+            <w:vAlign w:val="center"/>
+          </w:tcPr>
+          <w:p>
+            <w:pPr>
+              <w:spacing w:after="0"/>
+            </w:pPr>
+            <w:r>
+              <w:rPr>
+                <w:b w:val="false"/>
+                <w:bCs w:val="false"/>
+                <w:sz w:val="19"/>
+                <w:szCs w:val="19"/>
+              </w:rPr>
+              <w:t xml:space="preserve">Não</w:t>
+            </w:r>
+          </w:p>
+        </w:tc>
+        <w:tc>
+          <w:tcPr>
+            <w:tcW w:type="dxa" w:w="5300"/>
+            <w:shd w:fill="FFFFFF" w:val="clear"/>
+            <w:tcMar>
+              <w:top w:type="dxa" w:w="70"/>
+              <w:left w:type="dxa" w:w="110"/>
+              <w:bottom w:type="dxa" w:w="70"/>
+              <w:right w:type="dxa" w:w="110"/>
+            </w:tcMar>
+            <w:vAlign w:val="center"/>
+          </w:tcPr>
+          <w:p>
+            <w:pPr>
+              <w:spacing w:after="0"/>
+            </w:pPr>
+            <w:r>
+              <w:rPr>
+                <w:b w:val="false"/>
+                <w:bCs w:val="false"/>
+                <w:sz w:val="19"/>
+                <w:szCs w:val="19"/>
+              </w:rPr>
+              <w:t xml:space="preserve">Como publicados (P)</w:t>
             </w:r>
           </w:p>
         </w:tc>

</xml_diff>

<commit_message>
RREO normalizado e grupos de pares com a receita corrente líquida (ADR-038, adendo)
Normalização do RREO, do RGF e da DCA do SICONFI: cada linha vira
LinhaDemonstrativo (ente, exercício, período, demonstrativo, anexo, coluna,
conta e valor). lumen painel rcl coleta a receita corrente líquida do
exercício anterior de cada ente (RREO, Anexo 03, 6º bimestre) no tipo de RREO
que o extrato de entregas diz que o ente entregou: uma consulta por ente.
Roda no job da conformidade, só para quem falta (rcl-<UF>.json.gz).

Grupos de pares, versão 2 (porte-regiao-rcl-1): todo grupo com 30 entes com
RCL publicada se divide na mediana da RCL por habitante; o ente sem RCL fica
no grupo inteiro. O cartão do ente mostra a RCL por habitante e como a RCL
entrou no grupo, e a lista do grupo ganha a coluna.

Conferido contra a API real: RS com 497 RCL em 498 entes e 497 consultas
(426 RREO Simplificado, 71 completos); RR e AP com 31 de 33. DOC-05 1.3,
DOC-06 1.6, DOC-10 1.8, DOC-13 1.4 e DOC-11 regerados.
</commit_message>
<xml_diff>
--- a/docs/DOC-05_Modelo_de_Dados.docx
+++ b/docs/DOC-05_Modelo_de_Dados.docx
@@ -267,7 +267,7 @@
                 <w:sz w:val="19"/>
                 <w:szCs w:val="19"/>
               </w:rPr>
-              <w:t xml:space="preserve">1.2</w:t>
+              <w:t xml:space="preserve">1.3</w:t>
             </w:r>
           </w:p>
         </w:tc>
@@ -326,7 +326,7 @@
                 <w:sz w:val="19"/>
                 <w:szCs w:val="19"/>
               </w:rPr>
-              <w:t xml:space="preserve">16 de outubro de 2026</w:t>
+              <w:t xml:space="preserve">20 de outubro de 2026</w:t>
             </w:r>
           </w:p>
         </w:tc>
@@ -425,9 +425,11 @@
         <w:keepLines/>
         <w:spacing w:after="160" w:before="380"/>
       </w:pPr>
+      <w:bookmarkStart w:name="_Toc1" w:id="1"/>
       <w:r>
         <w:t xml:space="preserve">Sumário</w:t>
       </w:r>
+      <w:bookmarkEnd w:id="1"/>
     </w:p>
     <w:p>
       <w:pPr>
@@ -452,11 +454,805 @@
       </w:sdtPr>
       <w:sdtContent>
         <w:p>
+          <w:pPr>
+            <w:pStyle w:val="TOC1"/>
+            <w:tabs>
+              <w:tab w:val="right" w:pos="9638" w:leader="dot"/>
+            </w:tabs>
+          </w:pPr>
           <w:r>
             <w:fldChar w:fldCharType="begin" w:dirty="true"/>
             <w:instrText xml:space="preserve">TOC \h \o "1-3"</w:instrText>
             <w:fldChar w:fldCharType="separate"/>
           </w:r>
+          <w:hyperlink w:history="1" w:anchor="_Toc1">
+            <w:r>
+              <w:t xml:space="preserve">Sumário</w:t>
+            </w:r>
+            <w:r>
+              <w:tab/>
+            </w:r>
+            <w:r>
+              <w:fldChar w:fldCharType="begin" w:dirty="true"/>
+              <w:instrText xml:space="preserve">PAGEREF _Toc1 \h</w:instrText>
+              <w:fldChar w:fldCharType="separate"/>
+              <w:fldChar w:fldCharType="end"/>
+            </w:r>
+          </w:hyperlink>
+        </w:p>
+        <w:p>
+          <w:pPr>
+            <w:pStyle w:val="TOC1"/>
+            <w:tabs>
+              <w:tab w:val="right" w:pos="9638" w:leader="dot"/>
+            </w:tabs>
+          </w:pPr>
+          <w:hyperlink w:history="1" w:anchor="_Toc2">
+            <w:r>
+              <w:t xml:space="preserve">1. Princípios do modelo</w:t>
+            </w:r>
+            <w:r>
+              <w:tab/>
+            </w:r>
+            <w:r>
+              <w:fldChar w:fldCharType="begin" w:dirty="true"/>
+              <w:instrText xml:space="preserve">PAGEREF _Toc2 \h</w:instrText>
+              <w:fldChar w:fldCharType="separate"/>
+              <w:fldChar w:fldCharType="end"/>
+            </w:r>
+          </w:hyperlink>
+        </w:p>
+        <w:p>
+          <w:pPr>
+            <w:pStyle w:val="TOC1"/>
+            <w:tabs>
+              <w:tab w:val="right" w:pos="9638" w:leader="dot"/>
+            </w:tabs>
+          </w:pPr>
+          <w:hyperlink w:history="1" w:anchor="_Toc3">
+            <w:r>
+              <w:t xml:space="preserve">2. Diagrama entidade-relacionamento</w:t>
+            </w:r>
+            <w:r>
+              <w:tab/>
+            </w:r>
+            <w:r>
+              <w:fldChar w:fldCharType="begin" w:dirty="true"/>
+              <w:instrText xml:space="preserve">PAGEREF _Toc3 \h</w:instrText>
+              <w:fldChar w:fldCharType="separate"/>
+              <w:fldChar w:fldCharType="end"/>
+            </w:r>
+          </w:hyperlink>
+        </w:p>
+        <w:p>
+          <w:pPr>
+            <w:pStyle w:val="TOC2"/>
+            <w:tabs>
+              <w:tab w:val="right" w:pos="9638" w:leader="dot"/>
+            </w:tabs>
+            <w:ind w:left="220"/>
+          </w:pPr>
+          <w:hyperlink w:history="1" w:anchor="_Toc4">
+            <w:r>
+              <w:t xml:space="preserve">2.1 Os três blocos do modelo</w:t>
+            </w:r>
+            <w:r>
+              <w:tab/>
+            </w:r>
+            <w:r>
+              <w:fldChar w:fldCharType="begin" w:dirty="true"/>
+              <w:instrText xml:space="preserve">PAGEREF _Toc4 \h</w:instrText>
+              <w:fldChar w:fldCharType="separate"/>
+              <w:fldChar w:fldCharType="end"/>
+            </w:r>
+          </w:hyperlink>
+        </w:p>
+        <w:p>
+          <w:pPr>
+            <w:pStyle w:val="TOC1"/>
+            <w:tabs>
+              <w:tab w:val="right" w:pos="9638" w:leader="dot"/>
+            </w:tabs>
+          </w:pPr>
+          <w:hyperlink w:history="1" w:anchor="_Toc5">
+            <w:r>
+              <w:t xml:space="preserve">3. Dicionário de dados</w:t>
+            </w:r>
+            <w:r>
+              <w:tab/>
+            </w:r>
+            <w:r>
+              <w:fldChar w:fldCharType="begin" w:dirty="true"/>
+              <w:instrText xml:space="preserve">PAGEREF _Toc5 \h</w:instrText>
+              <w:fldChar w:fldCharType="separate"/>
+              <w:fldChar w:fldCharType="end"/>
+            </w:r>
+          </w:hyperlink>
+        </w:p>
+        <w:p>
+          <w:pPr>
+            <w:pStyle w:val="TOC2"/>
+            <w:tabs>
+              <w:tab w:val="right" w:pos="9638" w:leader="dot"/>
+            </w:tabs>
+            <w:ind w:left="220"/>
+          </w:pPr>
+          <w:hyperlink w:history="1" w:anchor="_Toc6">
+            <w:r>
+              <w:t xml:space="preserve">3.1 Bloco de fato administrativo</w:t>
+            </w:r>
+            <w:r>
+              <w:tab/>
+            </w:r>
+            <w:r>
+              <w:fldChar w:fldCharType="begin" w:dirty="true"/>
+              <w:instrText xml:space="preserve">PAGEREF _Toc6 \h</w:instrText>
+              <w:fldChar w:fldCharType="separate"/>
+              <w:fldChar w:fldCharType="end"/>
+            </w:r>
+          </w:hyperlink>
+        </w:p>
+        <w:p>
+          <w:pPr>
+            <w:pStyle w:val="TOC3"/>
+            <w:tabs>
+              <w:tab w:val="right" w:pos="9638" w:leader="dot"/>
+            </w:tabs>
+            <w:ind w:left="440"/>
+          </w:pPr>
+          <w:hyperlink w:history="1" w:anchor="_Toc7">
+            <w:r>
+              <w:t xml:space="preserve">Ente</w:t>
+            </w:r>
+            <w:r>
+              <w:tab/>
+            </w:r>
+            <w:r>
+              <w:fldChar w:fldCharType="begin" w:dirty="true"/>
+              <w:instrText xml:space="preserve">PAGEREF _Toc7 \h</w:instrText>
+              <w:fldChar w:fldCharType="separate"/>
+              <w:fldChar w:fldCharType="end"/>
+            </w:r>
+          </w:hyperlink>
+        </w:p>
+        <w:p>
+          <w:pPr>
+            <w:pStyle w:val="TOC3"/>
+            <w:tabs>
+              <w:tab w:val="right" w:pos="9638" w:leader="dot"/>
+            </w:tabs>
+            <w:ind w:left="440"/>
+          </w:pPr>
+          <w:hyperlink w:history="1" w:anchor="_Toc8">
+            <w:r>
+              <w:t xml:space="preserve">ProcessoContratacao</w:t>
+            </w:r>
+            <w:r>
+              <w:tab/>
+            </w:r>
+            <w:r>
+              <w:fldChar w:fldCharType="begin" w:dirty="true"/>
+              <w:instrText xml:space="preserve">PAGEREF _Toc8 \h</w:instrText>
+              <w:fldChar w:fldCharType="separate"/>
+              <w:fldChar w:fldCharType="end"/>
+            </w:r>
+          </w:hyperlink>
+        </w:p>
+        <w:p>
+          <w:pPr>
+            <w:pStyle w:val="TOC3"/>
+            <w:tabs>
+              <w:tab w:val="right" w:pos="9638" w:leader="dot"/>
+            </w:tabs>
+            <w:ind w:left="440"/>
+          </w:pPr>
+          <w:hyperlink w:history="1" w:anchor="_Toc9">
+            <w:r>
+              <w:t xml:space="preserve">AtoAutorizativo</w:t>
+            </w:r>
+            <w:r>
+              <w:tab/>
+            </w:r>
+            <w:r>
+              <w:fldChar w:fldCharType="begin" w:dirty="true"/>
+              <w:instrText xml:space="preserve">PAGEREF _Toc9 \h</w:instrText>
+              <w:fldChar w:fldCharType="separate"/>
+              <w:fldChar w:fldCharType="end"/>
+            </w:r>
+          </w:hyperlink>
+        </w:p>
+        <w:p>
+          <w:pPr>
+            <w:pStyle w:val="TOC3"/>
+            <w:tabs>
+              <w:tab w:val="right" w:pos="9638" w:leader="dot"/>
+            </w:tabs>
+            <w:ind w:left="440"/>
+          </w:pPr>
+          <w:hyperlink w:history="1" w:anchor="_Toc10">
+            <w:r>
+              <w:t xml:space="preserve">AgentePublico</w:t>
+            </w:r>
+            <w:r>
+              <w:tab/>
+            </w:r>
+            <w:r>
+              <w:fldChar w:fldCharType="begin" w:dirty="true"/>
+              <w:instrText xml:space="preserve">PAGEREF _Toc10 \h</w:instrText>
+              <w:fldChar w:fldCharType="separate"/>
+              <w:fldChar w:fldCharType="end"/>
+            </w:r>
+          </w:hyperlink>
+        </w:p>
+        <w:p>
+          <w:pPr>
+            <w:pStyle w:val="TOC3"/>
+            <w:tabs>
+              <w:tab w:val="right" w:pos="9638" w:leader="dot"/>
+            </w:tabs>
+            <w:ind w:left="440"/>
+          </w:pPr>
+          <w:hyperlink w:history="1" w:anchor="_Toc11">
+            <w:r>
+              <w:t xml:space="preserve">Contrato</w:t>
+            </w:r>
+            <w:r>
+              <w:tab/>
+            </w:r>
+            <w:r>
+              <w:fldChar w:fldCharType="begin" w:dirty="true"/>
+              <w:instrText xml:space="preserve">PAGEREF _Toc11 \h</w:instrText>
+              <w:fldChar w:fldCharType="separate"/>
+              <w:fldChar w:fldCharType="end"/>
+            </w:r>
+          </w:hyperlink>
+        </w:p>
+        <w:p>
+          <w:pPr>
+            <w:pStyle w:val="TOC3"/>
+            <w:tabs>
+              <w:tab w:val="right" w:pos="9638" w:leader="dot"/>
+            </w:tabs>
+            <w:ind w:left="440"/>
+          </w:pPr>
+          <w:hyperlink w:history="1" w:anchor="_Toc12">
+            <w:r>
+              <w:t xml:space="preserve">ItemContratado</w:t>
+            </w:r>
+            <w:r>
+              <w:tab/>
+            </w:r>
+            <w:r>
+              <w:fldChar w:fldCharType="begin" w:dirty="true"/>
+              <w:instrText xml:space="preserve">PAGEREF _Toc12 \h</w:instrText>
+              <w:fldChar w:fldCharType="separate"/>
+              <w:fldChar w:fldCharType="end"/>
+            </w:r>
+          </w:hyperlink>
+        </w:p>
+        <w:p>
+          <w:pPr>
+            <w:pStyle w:val="TOC3"/>
+            <w:tabs>
+              <w:tab w:val="right" w:pos="9638" w:leader="dot"/>
+            </w:tabs>
+            <w:ind w:left="440"/>
+          </w:pPr>
+          <w:hyperlink w:history="1" w:anchor="_Toc13">
+            <w:r>
+              <w:t xml:space="preserve">Empenho</w:t>
+            </w:r>
+            <w:r>
+              <w:tab/>
+            </w:r>
+            <w:r>
+              <w:fldChar w:fldCharType="begin" w:dirty="true"/>
+              <w:instrText xml:space="preserve">PAGEREF _Toc13 \h</w:instrText>
+              <w:fldChar w:fldCharType="separate"/>
+              <w:fldChar w:fldCharType="end"/>
+            </w:r>
+          </w:hyperlink>
+        </w:p>
+        <w:p>
+          <w:pPr>
+            <w:pStyle w:val="TOC2"/>
+            <w:tabs>
+              <w:tab w:val="right" w:pos="9638" w:leader="dot"/>
+            </w:tabs>
+            <w:ind w:left="220"/>
+          </w:pPr>
+          <w:hyperlink w:history="1" w:anchor="_Toc14">
+            <w:r>
+              <w:t xml:space="preserve">3.2 Bloco de contexto</w:t>
+            </w:r>
+            <w:r>
+              <w:tab/>
+            </w:r>
+            <w:r>
+              <w:fldChar w:fldCharType="begin" w:dirty="true"/>
+              <w:instrText xml:space="preserve">PAGEREF _Toc14 \h</w:instrText>
+              <w:fldChar w:fldCharType="separate"/>
+              <w:fldChar w:fldCharType="end"/>
+            </w:r>
+          </w:hyperlink>
+        </w:p>
+        <w:p>
+          <w:pPr>
+            <w:pStyle w:val="TOC3"/>
+            <w:tabs>
+              <w:tab w:val="right" w:pos="9638" w:leader="dot"/>
+            </w:tabs>
+            <w:ind w:left="440"/>
+          </w:pPr>
+          <w:hyperlink w:history="1" w:anchor="_Toc15">
+            <w:r>
+              <w:t xml:space="preserve">Fornecedor</w:t>
+            </w:r>
+            <w:r>
+              <w:tab/>
+            </w:r>
+            <w:r>
+              <w:fldChar w:fldCharType="begin" w:dirty="true"/>
+              <w:instrText xml:space="preserve">PAGEREF _Toc15 \h</w:instrText>
+              <w:fldChar w:fldCharType="separate"/>
+              <w:fldChar w:fldCharType="end"/>
+            </w:r>
+          </w:hyperlink>
+        </w:p>
+        <w:p>
+          <w:pPr>
+            <w:pStyle w:val="TOC3"/>
+            <w:tabs>
+              <w:tab w:val="right" w:pos="9638" w:leader="dot"/>
+            </w:tabs>
+            <w:ind w:left="440"/>
+          </w:pPr>
+          <w:hyperlink w:history="1" w:anchor="_Toc16">
+            <w:r>
+              <w:t xml:space="preserve">Sancao</w:t>
+            </w:r>
+            <w:r>
+              <w:tab/>
+            </w:r>
+            <w:r>
+              <w:fldChar w:fldCharType="begin" w:dirty="true"/>
+              <w:instrText xml:space="preserve">PAGEREF _Toc16 \h</w:instrText>
+              <w:fldChar w:fldCharType="separate"/>
+              <w:fldChar w:fldCharType="end"/>
+            </w:r>
+          </w:hyperlink>
+        </w:p>
+        <w:p>
+          <w:pPr>
+            <w:pStyle w:val="TOC3"/>
+            <w:tabs>
+              <w:tab w:val="right" w:pos="9638" w:leader="dot"/>
+            </w:tabs>
+            <w:ind w:left="440"/>
+          </w:pPr>
+          <w:hyperlink w:history="1" w:anchor="_Toc17">
+            <w:r>
+              <w:t xml:space="preserve">GrupoPares</w:t>
+            </w:r>
+            <w:r>
+              <w:tab/>
+            </w:r>
+            <w:r>
+              <w:fldChar w:fldCharType="begin" w:dirty="true"/>
+              <w:instrText xml:space="preserve">PAGEREF _Toc17 \h</w:instrText>
+              <w:fldChar w:fldCharType="separate"/>
+              <w:fldChar w:fldCharType="end"/>
+            </w:r>
+          </w:hyperlink>
+        </w:p>
+        <w:p>
+          <w:pPr>
+            <w:pStyle w:val="TOC2"/>
+            <w:tabs>
+              <w:tab w:val="right" w:pos="9638" w:leader="dot"/>
+            </w:tabs>
+            <w:ind w:left="220"/>
+          </w:pPr>
+          <w:hyperlink w:history="1" w:anchor="_Toc18">
+            <w:r>
+              <w:t xml:space="preserve">3.3 Bloco de análise e prova</w:t>
+            </w:r>
+            <w:r>
+              <w:tab/>
+            </w:r>
+            <w:r>
+              <w:fldChar w:fldCharType="begin" w:dirty="true"/>
+              <w:instrText xml:space="preserve">PAGEREF _Toc18 \h</w:instrText>
+              <w:fldChar w:fldCharType="separate"/>
+              <w:fldChar w:fldCharType="end"/>
+            </w:r>
+          </w:hyperlink>
+        </w:p>
+        <w:p>
+          <w:pPr>
+            <w:pStyle w:val="TOC3"/>
+            <w:tabs>
+              <w:tab w:val="right" w:pos="9638" w:leader="dot"/>
+            </w:tabs>
+            <w:ind w:left="440"/>
+          </w:pPr>
+          <w:hyperlink w:history="1" w:anchor="_Toc19">
+            <w:r>
+              <w:t xml:space="preserve">DocumentoFonte</w:t>
+            </w:r>
+            <w:r>
+              <w:tab/>
+            </w:r>
+            <w:r>
+              <w:fldChar w:fldCharType="begin" w:dirty="true"/>
+              <w:instrText xml:space="preserve">PAGEREF _Toc19 \h</w:instrText>
+              <w:fldChar w:fldCharType="separate"/>
+              <w:fldChar w:fldCharType="end"/>
+            </w:r>
+          </w:hyperlink>
+        </w:p>
+        <w:p>
+          <w:pPr>
+            <w:pStyle w:val="TOC3"/>
+            <w:tabs>
+              <w:tab w:val="right" w:pos="9638" w:leader="dot"/>
+            </w:tabs>
+            <w:ind w:left="440"/>
+          </w:pPr>
+          <w:hyperlink w:history="1" w:anchor="_Toc20">
+            <w:r>
+              <w:t xml:space="preserve">RegraDeteccao</w:t>
+            </w:r>
+            <w:r>
+              <w:tab/>
+            </w:r>
+            <w:r>
+              <w:fldChar w:fldCharType="begin" w:dirty="true"/>
+              <w:instrText xml:space="preserve">PAGEREF _Toc20 \h</w:instrText>
+              <w:fldChar w:fldCharType="separate"/>
+              <w:fldChar w:fldCharType="end"/>
+            </w:r>
+          </w:hyperlink>
+        </w:p>
+        <w:p>
+          <w:pPr>
+            <w:pStyle w:val="TOC3"/>
+            <w:tabs>
+              <w:tab w:val="right" w:pos="9638" w:leader="dot"/>
+            </w:tabs>
+            <w:ind w:left="440"/>
+          </w:pPr>
+          <w:hyperlink w:history="1" w:anchor="_Toc21">
+            <w:r>
+              <w:t xml:space="preserve">Indicio</w:t>
+            </w:r>
+            <w:r>
+              <w:tab/>
+            </w:r>
+            <w:r>
+              <w:fldChar w:fldCharType="begin" w:dirty="true"/>
+              <w:instrText xml:space="preserve">PAGEREF _Toc21 \h</w:instrText>
+              <w:fldChar w:fldCharType="separate"/>
+              <w:fldChar w:fldCharType="end"/>
+            </w:r>
+          </w:hyperlink>
+        </w:p>
+        <w:p>
+          <w:pPr>
+            <w:pStyle w:val="TOC3"/>
+            <w:tabs>
+              <w:tab w:val="right" w:pos="9638" w:leader="dot"/>
+            </w:tabs>
+            <w:ind w:left="440"/>
+          </w:pPr>
+          <w:hyperlink w:history="1" w:anchor="_Toc22">
+            <w:r>
+              <w:t xml:space="preserve">Evidencia</w:t>
+            </w:r>
+            <w:r>
+              <w:tab/>
+            </w:r>
+            <w:r>
+              <w:fldChar w:fldCharType="begin" w:dirty="true"/>
+              <w:instrText xml:space="preserve">PAGEREF _Toc22 \h</w:instrText>
+              <w:fldChar w:fldCharType="separate"/>
+              <w:fldChar w:fldCharType="end"/>
+            </w:r>
+          </w:hyperlink>
+        </w:p>
+        <w:p>
+          <w:pPr>
+            <w:pStyle w:val="TOC3"/>
+            <w:tabs>
+              <w:tab w:val="right" w:pos="9638" w:leader="dot"/>
+            </w:tabs>
+            <w:ind w:left="440"/>
+          </w:pPr>
+          <w:hyperlink w:history="1" w:anchor="_Toc23">
+            <w:r>
+              <w:t xml:space="preserve">Contestacao</w:t>
+            </w:r>
+            <w:r>
+              <w:tab/>
+            </w:r>
+            <w:r>
+              <w:fldChar w:fldCharType="begin" w:dirty="true"/>
+              <w:instrText xml:space="preserve">PAGEREF _Toc23 \h</w:instrText>
+              <w:fldChar w:fldCharType="separate"/>
+              <w:fldChar w:fldCharType="end"/>
+            </w:r>
+          </w:hyperlink>
+        </w:p>
+        <w:p>
+          <w:pPr>
+            <w:pStyle w:val="TOC3"/>
+            <w:tabs>
+              <w:tab w:val="right" w:pos="9638" w:leader="dot"/>
+            </w:tabs>
+            <w:ind w:left="440"/>
+          </w:pPr>
+          <w:hyperlink w:history="1" w:anchor="_Toc24">
+            <w:r>
+              <w:t xml:space="preserve">Conformidade</w:t>
+            </w:r>
+            <w:r>
+              <w:tab/>
+            </w:r>
+            <w:r>
+              <w:fldChar w:fldCharType="begin" w:dirty="true"/>
+              <w:instrText xml:space="preserve">PAGEREF _Toc24 \h</w:instrText>
+              <w:fldChar w:fldCharType="separate"/>
+              <w:fldChar w:fldCharType="end"/>
+            </w:r>
+          </w:hyperlink>
+        </w:p>
+        <w:p>
+          <w:pPr>
+            <w:pStyle w:val="TOC1"/>
+            <w:tabs>
+              <w:tab w:val="right" w:pos="9638" w:leader="dot"/>
+            </w:tabs>
+          </w:pPr>
+          <w:hyperlink w:history="1" w:anchor="_Toc25">
+            <w:r>
+              <w:t xml:space="preserve">4. Ciclo de vida do indício</w:t>
+            </w:r>
+            <w:r>
+              <w:tab/>
+            </w:r>
+            <w:r>
+              <w:fldChar w:fldCharType="begin" w:dirty="true"/>
+              <w:instrText xml:space="preserve">PAGEREF _Toc25 \h</w:instrText>
+              <w:fldChar w:fldCharType="separate"/>
+              <w:fldChar w:fldCharType="end"/>
+            </w:r>
+          </w:hyperlink>
+        </w:p>
+        <w:p>
+          <w:pPr>
+            <w:pStyle w:val="TOC1"/>
+            <w:tabs>
+              <w:tab w:val="right" w:pos="9638" w:leader="dot"/>
+            </w:tabs>
+          </w:pPr>
+          <w:hyperlink w:history="1" w:anchor="_Toc26">
+            <w:r>
+              <w:t xml:space="preserve">5. Identidade e resolução de entidades</w:t>
+            </w:r>
+            <w:r>
+              <w:tab/>
+            </w:r>
+            <w:r>
+              <w:fldChar w:fldCharType="begin" w:dirty="true"/>
+              <w:instrText xml:space="preserve">PAGEREF _Toc26 \h</w:instrText>
+              <w:fldChar w:fldCharType="separate"/>
+              <w:fldChar w:fldCharType="end"/>
+            </w:r>
+          </w:hyperlink>
+        </w:p>
+        <w:p>
+          <w:pPr>
+            <w:pStyle w:val="TOC1"/>
+            <w:tabs>
+              <w:tab w:val="right" w:pos="9638" w:leader="dot"/>
+            </w:tabs>
+          </w:pPr>
+          <w:hyperlink w:history="1" w:anchor="_Toc27">
+            <w:r>
+              <w:t xml:space="preserve">6. Qualidade de dados</w:t>
+            </w:r>
+            <w:r>
+              <w:tab/>
+            </w:r>
+            <w:r>
+              <w:fldChar w:fldCharType="begin" w:dirty="true"/>
+              <w:instrText xml:space="preserve">PAGEREF _Toc27 \h</w:instrText>
+              <w:fldChar w:fldCharType="separate"/>
+              <w:fldChar w:fldCharType="end"/>
+            </w:r>
+          </w:hyperlink>
+        </w:p>
+        <w:p>
+          <w:pPr>
+            <w:pStyle w:val="TOC1"/>
+            <w:tabs>
+              <w:tab w:val="right" w:pos="9638" w:leader="dot"/>
+            </w:tabs>
+          </w:pPr>
+          <w:hyperlink w:history="1" w:anchor="_Toc28">
+            <w:r>
+              <w:t xml:space="preserve">7. Particionamento e retenção</w:t>
+            </w:r>
+            <w:r>
+              <w:tab/>
+            </w:r>
+            <w:r>
+              <w:fldChar w:fldCharType="begin" w:dirty="true"/>
+              <w:instrText xml:space="preserve">PAGEREF _Toc28 \h</w:instrText>
+              <w:fldChar w:fldCharType="separate"/>
+              <w:fldChar w:fldCharType="end"/>
+            </w:r>
+          </w:hyperlink>
+        </w:p>
+        <w:p>
+          <w:pPr>
+            <w:pStyle w:val="TOC1"/>
+            <w:tabs>
+              <w:tab w:val="right" w:pos="9638" w:leader="dot"/>
+            </w:tabs>
+          </w:pPr>
+          <w:hyperlink w:history="1" w:anchor="_Toc29">
+            <w:r>
+              <w:t xml:space="preserve">8. Implementação da Fase 1</w:t>
+            </w:r>
+            <w:r>
+              <w:tab/>
+            </w:r>
+            <w:r>
+              <w:fldChar w:fldCharType="begin" w:dirty="true"/>
+              <w:instrText xml:space="preserve">PAGEREF _Toc29 \h</w:instrText>
+              <w:fldChar w:fldCharType="separate"/>
+              <w:fldChar w:fldCharType="end"/>
+            </w:r>
+          </w:hyperlink>
+        </w:p>
+        <w:p>
+          <w:pPr>
+            <w:pStyle w:val="TOC2"/>
+            <w:tabs>
+              <w:tab w:val="right" w:pos="9638" w:leader="dot"/>
+            </w:tabs>
+            <w:ind w:left="220"/>
+          </w:pPr>
+          <w:hyperlink w:history="1" w:anchor="_Toc30">
+            <w:r>
+              <w:t xml:space="preserve">8.1 Do modelo conceitual às entidades implementadas</w:t>
+            </w:r>
+            <w:r>
+              <w:tab/>
+            </w:r>
+            <w:r>
+              <w:fldChar w:fldCharType="begin" w:dirty="true"/>
+              <w:instrText xml:space="preserve">PAGEREF _Toc30 \h</w:instrText>
+              <w:fldChar w:fldCharType="separate"/>
+              <w:fldChar w:fldCharType="end"/>
+            </w:r>
+          </w:hyperlink>
+        </w:p>
+        <w:p>
+          <w:pPr>
+            <w:pStyle w:val="TOC2"/>
+            <w:tabs>
+              <w:tab w:val="right" w:pos="9638" w:leader="dot"/>
+            </w:tabs>
+            <w:ind w:left="220"/>
+          </w:pPr>
+          <w:hyperlink w:history="1" w:anchor="_Toc31">
+            <w:r>
+              <w:t xml:space="preserve">8.2 Identidade determinística</w:t>
+            </w:r>
+            <w:r>
+              <w:tab/>
+            </w:r>
+            <w:r>
+              <w:fldChar w:fldCharType="begin" w:dirty="true"/>
+              <w:instrText xml:space="preserve">PAGEREF _Toc31 \h</w:instrText>
+              <w:fldChar w:fldCharType="separate"/>
+              <w:fldChar w:fldCharType="end"/>
+            </w:r>
+          </w:hyperlink>
+        </w:p>
+        <w:p>
+          <w:pPr>
+            <w:pStyle w:val="TOC2"/>
+            <w:tabs>
+              <w:tab w:val="right" w:pos="9638" w:leader="dot"/>
+            </w:tabs>
+            <w:ind w:left="220"/>
+          </w:pPr>
+          <w:hyperlink w:history="1" w:anchor="_Toc32">
+            <w:r>
+              <w:t xml:space="preserve">8.3 Divergências registradas</w:t>
+            </w:r>
+            <w:r>
+              <w:tab/>
+            </w:r>
+            <w:r>
+              <w:fldChar w:fldCharType="begin" w:dirty="true"/>
+              <w:instrText xml:space="preserve">PAGEREF _Toc32 \h</w:instrText>
+              <w:fldChar w:fldCharType="separate"/>
+              <w:fldChar w:fldCharType="end"/>
+            </w:r>
+          </w:hyperlink>
+        </w:p>
+        <w:p>
+          <w:pPr>
+            <w:pStyle w:val="TOC2"/>
+            <w:tabs>
+              <w:tab w:val="right" w:pos="9638" w:leader="dot"/>
+            </w:tabs>
+            <w:ind w:left="220"/>
+          </w:pPr>
+          <w:hyperlink w:history="1" w:anchor="_Toc33">
+            <w:r>
+              <w:t xml:space="preserve">8.4 Quarentena e marcações de qualidade</w:t>
+            </w:r>
+            <w:r>
+              <w:tab/>
+            </w:r>
+            <w:r>
+              <w:fldChar w:fldCharType="begin" w:dirty="true"/>
+              <w:instrText xml:space="preserve">PAGEREF _Toc33 \h</w:instrText>
+              <w:fldChar w:fldCharType="separate"/>
+              <w:fldChar w:fldCharType="end"/>
+            </w:r>
+          </w:hyperlink>
+        </w:p>
+        <w:p>
+          <w:pPr>
+            <w:pStyle w:val="TOC2"/>
+            <w:tabs>
+              <w:tab w:val="right" w:pos="9638" w:leader="dot"/>
+            </w:tabs>
+            <w:ind w:left="220"/>
+          </w:pPr>
+          <w:hyperlink w:history="1" w:anchor="_Toc34">
+            <w:r>
+              <w:t xml:space="preserve">8.5 Armazenamento da silver</w:t>
+            </w:r>
+            <w:r>
+              <w:tab/>
+            </w:r>
+            <w:r>
+              <w:fldChar w:fldCharType="begin" w:dirty="true"/>
+              <w:instrText xml:space="preserve">PAGEREF _Toc34 \h</w:instrText>
+              <w:fldChar w:fldCharType="separate"/>
+              <w:fldChar w:fldCharType="end"/>
+            </w:r>
+          </w:hyperlink>
+        </w:p>
+        <w:p>
+          <w:pPr>
+            <w:pStyle w:val="TOC2"/>
+            <w:tabs>
+              <w:tab w:val="right" w:pos="9638" w:leader="dot"/>
+            </w:tabs>
+            <w:ind w:left="220"/>
+          </w:pPr>
+          <w:hyperlink w:history="1" w:anchor="_Toc35">
+            <w:r>
+              <w:t xml:space="preserve">8.6 Banco de domínio (migração 0001)</w:t>
+            </w:r>
+            <w:r>
+              <w:tab/>
+            </w:r>
+            <w:r>
+              <w:fldChar w:fldCharType="begin" w:dirty="true"/>
+              <w:instrText xml:space="preserve">PAGEREF _Toc35 \h</w:instrText>
+              <w:fldChar w:fldCharType="separate"/>
+              <w:fldChar w:fldCharType="end"/>
+            </w:r>
+          </w:hyperlink>
         </w:p>
         <w:p>
           <w:r>
@@ -477,9 +1273,11 @@
         <w:keepLines/>
         <w:spacing w:after="160" w:before="380"/>
       </w:pPr>
+      <w:bookmarkStart w:name="_Toc2" w:id="2"/>
       <w:r>
         <w:t xml:space="preserve">1. Princípios do modelo</w:t>
       </w:r>
+      <w:bookmarkEnd w:id="2"/>
     </w:p>
     <w:p>
       <w:pPr>
@@ -553,9 +1351,11 @@
         <w:keepLines/>
         <w:spacing w:after="160" w:before="380"/>
       </w:pPr>
+      <w:bookmarkStart w:name="_Toc3" w:id="3"/>
       <w:r>
         <w:t xml:space="preserve">2. Diagrama entidade-relacionamento</w:t>
       </w:r>
+      <w:bookmarkEnd w:id="3"/>
     </w:p>
     <w:p>
       <w:pPr>
@@ -626,9 +1426,11 @@
         <w:keepLines/>
         <w:spacing w:after="120" w:before="280"/>
       </w:pPr>
+      <w:bookmarkStart w:name="_Toc4" w:id="4"/>
       <w:r>
         <w:t xml:space="preserve">2.1 Os três blocos do modelo</w:t>
       </w:r>
+      <w:bookmarkEnd w:id="4"/>
     </w:p>
     <w:tbl>
       <w:tblPr>
@@ -1061,9 +1863,11 @@
         <w:keepLines/>
         <w:spacing w:after="160" w:before="380"/>
       </w:pPr>
+      <w:bookmarkStart w:name="_Toc5" w:id="5"/>
       <w:r>
         <w:t xml:space="preserve">3. Dicionário de dados</w:t>
       </w:r>
+      <w:bookmarkEnd w:id="5"/>
     </w:p>
     <w:p>
       <w:pPr>
@@ -1086,9 +1890,11 @@
         <w:keepLines/>
         <w:spacing w:after="120" w:before="280"/>
       </w:pPr>
+      <w:bookmarkStart w:name="_Toc6" w:id="6"/>
       <w:r>
         <w:t xml:space="preserve">3.1 Bloco de fato administrativo</w:t>
       </w:r>
+      <w:bookmarkEnd w:id="6"/>
     </w:p>
     <w:p>
       <w:pPr>
@@ -1097,9 +1903,11 @@
         <w:keepLines/>
         <w:spacing w:after="100" w:before="220"/>
       </w:pPr>
+      <w:bookmarkStart w:name="_Toc7" w:id="7"/>
       <w:r>
         <w:t xml:space="preserve">Ente</w:t>
       </w:r>
+      <w:bookmarkEnd w:id="7"/>
     </w:p>
     <w:p>
       <w:pPr>
@@ -2506,9 +3314,11 @@
         <w:keepLines/>
         <w:spacing w:after="100" w:before="220"/>
       </w:pPr>
+      <w:bookmarkStart w:name="_Toc8" w:id="8"/>
       <w:r>
         <w:t xml:space="preserve">ProcessoContratacao</w:t>
       </w:r>
+      <w:bookmarkEnd w:id="8"/>
     </w:p>
     <w:p>
       <w:pPr>
@@ -4141,9 +4951,11 @@
         <w:keepLines/>
         <w:spacing w:after="100" w:before="220"/>
       </w:pPr>
+      <w:bookmarkStart w:name="_Toc9" w:id="9"/>
       <w:r>
         <w:t xml:space="preserve">AtoAutorizativo</w:t>
       </w:r>
+      <w:bookmarkEnd w:id="9"/>
     </w:p>
     <w:p>
       <w:pPr>
@@ -5324,9 +6136,11 @@
         <w:keepLines/>
         <w:spacing w:after="100" w:before="220"/>
       </w:pPr>
+      <w:bookmarkStart w:name="_Toc10" w:id="10"/>
       <w:r>
         <w:t xml:space="preserve">AgentePublico</w:t>
       </w:r>
+      <w:bookmarkEnd w:id="10"/>
     </w:p>
     <w:p>
       <w:pPr>
@@ -6055,9 +6869,11 @@
         <w:keepLines/>
         <w:spacing w:after="100" w:before="220"/>
       </w:pPr>
+      <w:bookmarkStart w:name="_Toc11" w:id="11"/>
       <w:r>
         <w:t xml:space="preserve">Contrato</w:t>
       </w:r>
+      <w:bookmarkEnd w:id="11"/>
     </w:p>
     <w:p>
       <w:pPr>
@@ -7690,9 +8506,11 @@
         <w:keepLines/>
         <w:spacing w:after="100" w:before="220"/>
       </w:pPr>
+      <w:bookmarkStart w:name="_Toc12" w:id="12"/>
       <w:r>
         <w:t xml:space="preserve">ItemContratado</w:t>
       </w:r>
+      <w:bookmarkEnd w:id="12"/>
     </w:p>
     <w:p>
       <w:pPr>
@@ -8760,9 +9578,11 @@
         <w:keepLines/>
         <w:spacing w:after="100" w:before="220"/>
       </w:pPr>
+      <w:bookmarkStart w:name="_Toc13" w:id="13"/>
       <w:r>
         <w:t xml:space="preserve">Empenho</w:t>
       </w:r>
+      <w:bookmarkEnd w:id="13"/>
     </w:p>
     <w:p>
       <w:pPr>
@@ -10287,9 +11107,11 @@
         <w:keepLines/>
         <w:spacing w:after="120" w:before="280"/>
       </w:pPr>
+      <w:bookmarkStart w:name="_Toc14" w:id="14"/>
       <w:r>
         <w:t xml:space="preserve">3.2 Bloco de contexto</w:t>
       </w:r>
+      <w:bookmarkEnd w:id="14"/>
     </w:p>
     <w:p>
       <w:pPr>
@@ -10298,9 +11120,11 @@
         <w:keepLines/>
         <w:spacing w:after="100" w:before="220"/>
       </w:pPr>
+      <w:bookmarkStart w:name="_Toc15" w:id="15"/>
       <w:r>
         <w:t xml:space="preserve">Fornecedor</w:t>
       </w:r>
+      <w:bookmarkEnd w:id="15"/>
     </w:p>
     <w:p>
       <w:pPr>
@@ -11594,9 +12418,11 @@
         <w:keepLines/>
         <w:spacing w:after="100" w:before="220"/>
       </w:pPr>
+      <w:bookmarkStart w:name="_Toc16" w:id="16"/>
       <w:r>
         <w:t xml:space="preserve">Sancao</w:t>
       </w:r>
+      <w:bookmarkEnd w:id="16"/>
     </w:p>
     <w:p>
       <w:pPr>
@@ -13229,9 +14055,11 @@
         <w:keepLines/>
         <w:spacing w:after="100" w:before="220"/>
       </w:pPr>
+      <w:bookmarkStart w:name="_Toc17" w:id="17"/>
       <w:r>
         <w:t xml:space="preserve">GrupoPares</w:t>
       </w:r>
+      <w:bookmarkEnd w:id="17"/>
     </w:p>
     <w:p>
       <w:pPr>
@@ -14073,9 +14901,11 @@
         <w:keepLines/>
         <w:spacing w:after="120" w:before="280"/>
       </w:pPr>
+      <w:bookmarkStart w:name="_Toc18" w:id="18"/>
       <w:r>
         <w:t xml:space="preserve">3.3 Bloco de análise e prova</w:t>
       </w:r>
+      <w:bookmarkEnd w:id="18"/>
     </w:p>
     <w:p>
       <w:pPr>
@@ -14084,9 +14914,11 @@
         <w:keepLines/>
         <w:spacing w:after="100" w:before="220"/>
       </w:pPr>
+      <w:bookmarkStart w:name="_Toc19" w:id="19"/>
       <w:r>
         <w:t xml:space="preserve">DocumentoFonte</w:t>
       </w:r>
+      <w:bookmarkEnd w:id="19"/>
     </w:p>
     <w:p>
       <w:pPr>
@@ -15380,9 +16212,11 @@
         <w:keepLines/>
         <w:spacing w:after="100" w:before="220"/>
       </w:pPr>
+      <w:bookmarkStart w:name="_Toc20" w:id="20"/>
       <w:r>
         <w:t xml:space="preserve">RegraDeteccao</w:t>
       </w:r>
+      <w:bookmarkEnd w:id="20"/>
     </w:p>
     <w:p>
       <w:pPr>
@@ -16563,9 +17397,11 @@
         <w:keepLines/>
         <w:spacing w:after="100" w:before="220"/>
       </w:pPr>
+      <w:bookmarkStart w:name="_Toc21" w:id="21"/>
       <w:r>
         <w:t xml:space="preserve">Indicio</w:t>
       </w:r>
+      <w:bookmarkEnd w:id="21"/>
     </w:p>
     <w:p>
       <w:pPr>
@@ -18424,9 +19260,11 @@
         <w:keepLines/>
         <w:spacing w:after="100" w:before="220"/>
       </w:pPr>
+      <w:bookmarkStart w:name="_Toc22" w:id="22"/>
       <w:r>
         <w:t xml:space="preserve">Evidencia</w:t>
       </w:r>
+      <w:bookmarkEnd w:id="22"/>
     </w:p>
     <w:p>
       <w:pPr>
@@ -19155,9 +19993,11 @@
         <w:keepLines/>
         <w:spacing w:after="100" w:before="220"/>
       </w:pPr>
+      <w:bookmarkStart w:name="_Toc23" w:id="23"/>
       <w:r>
         <w:t xml:space="preserve">Contestacao</w:t>
       </w:r>
+      <w:bookmarkEnd w:id="23"/>
     </w:p>
     <w:p>
       <w:pPr>
@@ -20451,9 +21291,11 @@
         <w:keepLines/>
         <w:spacing w:after="100" w:before="220"/>
       </w:pPr>
+      <w:bookmarkStart w:name="_Toc24" w:id="24"/>
       <w:r>
         <w:t xml:space="preserve">Conformidade</w:t>
       </w:r>
+      <w:bookmarkEnd w:id="24"/>
     </w:p>
     <w:p>
       <w:pPr>
@@ -21413,9 +22255,11 @@
         <w:keepLines/>
         <w:spacing w:after="160" w:before="380"/>
       </w:pPr>
+      <w:bookmarkStart w:name="_Toc25" w:id="25"/>
       <w:r>
         <w:t xml:space="preserve">4. Ciclo de vida do indício</w:t>
       </w:r>
+      <w:bookmarkEnd w:id="25"/>
     </w:p>
     <w:p>
       <w:pPr>
@@ -21500,9 +22344,11 @@
         <w:keepLines/>
         <w:spacing w:after="160" w:before="380"/>
       </w:pPr>
+      <w:bookmarkStart w:name="_Toc26" w:id="26"/>
       <w:r>
         <w:t xml:space="preserve">5. Identidade e resolução de entidades</w:t>
       </w:r>
+      <w:bookmarkEnd w:id="26"/>
     </w:p>
     <w:p>
       <w:pPr>
@@ -22130,9 +22976,11 @@
         <w:keepLines/>
         <w:spacing w:after="160" w:before="380"/>
       </w:pPr>
+      <w:bookmarkStart w:name="_Toc27" w:id="27"/>
       <w:r>
         <w:t xml:space="preserve">6. Qualidade de dados</w:t>
       </w:r>
+      <w:bookmarkEnd w:id="27"/>
     </w:p>
     <w:p>
       <w:pPr>
@@ -22778,9 +23626,11 @@
         <w:keepLines/>
         <w:spacing w:after="160" w:before="380"/>
       </w:pPr>
+      <w:bookmarkStart w:name="_Toc28" w:id="28"/>
       <w:r>
         <w:t xml:space="preserve">7. Particionamento e retenção</w:t>
       </w:r>
+      <w:bookmarkEnd w:id="28"/>
     </w:p>
     <w:tbl>
       <w:tblPr>
@@ -23327,9 +24177,11 @@
         <w:pageBreakBefore/>
         <w:spacing w:after="160" w:before="380"/>
       </w:pPr>
+      <w:bookmarkStart w:name="_Toc29" w:id="29"/>
       <w:r>
         <w:t xml:space="preserve">8. Implementação da Fase 1</w:t>
       </w:r>
+      <w:bookmarkEnd w:id="29"/>
     </w:p>
     <w:p>
       <w:pPr>
@@ -23352,9 +24204,11 @@
         <w:keepLines/>
         <w:spacing w:after="120" w:before="280"/>
       </w:pPr>
+      <w:bookmarkStart w:name="_Toc30" w:id="30"/>
       <w:r>
         <w:t xml:space="preserve">8.1 Do modelo conceitual às entidades implementadas</w:t>
       </w:r>
+      <w:bookmarkEnd w:id="30"/>
     </w:p>
     <w:tbl>
       <w:tblPr>
@@ -24091,7 +24945,7 @@
                 <w:sz w:val="17"/>
                 <w:szCs w:val="17"/>
               </w:rPr>
-              <w:t xml:space="preserve">AtoAutorizativo, AgentePublico</w:t>
+              <w:t xml:space="preserve">Dados fiscais (insumo)</w:t>
             </w:r>
           </w:p>
         </w:tc>
@@ -24118,7 +24972,7 @@
                 <w:sz w:val="17"/>
                 <w:szCs w:val="17"/>
               </w:rPr>
-              <w:t xml:space="preserve">Não preenchidas</w:t>
+              <w:t xml:space="preserve">LinhaDemonstrativo</w:t>
             </w:r>
           </w:p>
         </w:tc>
@@ -24145,7 +24999,7 @@
                 <w:sz w:val="17"/>
                 <w:szCs w:val="17"/>
               </w:rPr>
-              <w:t xml:space="preserve">A API do PNCP não publica quem autorizou o ato (seção 8.3)</w:t>
+              <w:t xml:space="preserve">Nova: cada linha do RREO, do RGF e da DCA como o Tesouro publica (ente, exercício, período, demonstrativo, anexo, coluna, conta e valor); dela sai a receita corrente líquida do ente, usada no grupo de pares (ADR-038)</w:t>
             </w:r>
           </w:p>
         </w:tc>
@@ -24177,7 +25031,7 @@
                 <w:sz w:val="17"/>
                 <w:szCs w:val="17"/>
               </w:rPr>
-              <w:t xml:space="preserve">Empenho, Liquidacao, Pagamento</w:t>
+              <w:t xml:space="preserve">AtoAutorizativo, AgentePublico</w:t>
             </w:r>
           </w:p>
         </w:tc>
@@ -24231,7 +25085,7 @@
                 <w:sz w:val="17"/>
                 <w:szCs w:val="17"/>
               </w:rPr>
-              <w:t xml:space="preserve">Dependem do Portal da Transparência e de fontes estaduais (fases seguintes)</w:t>
+              <w:t xml:space="preserve">A API do PNCP não publica quem autorizou o ato (seção 8.3)</w:t>
             </w:r>
           </w:p>
         </w:tc>
@@ -24263,7 +25117,7 @@
                 <w:sz w:val="17"/>
                 <w:szCs w:val="17"/>
               </w:rPr>
-              <w:t xml:space="preserve">Fornecedor</w:t>
+              <w:t xml:space="preserve">Empenho, Liquidacao, Pagamento</w:t>
             </w:r>
           </w:p>
         </w:tc>
@@ -24290,6 +25144,92 @@
                 <w:sz w:val="17"/>
                 <w:szCs w:val="17"/>
               </w:rPr>
+              <w:t xml:space="preserve">Não preenchidas</w:t>
+            </w:r>
+          </w:p>
+        </w:tc>
+        <w:tc>
+          <w:tcPr>
+            <w:tcW w:type="dxa" w:w="4600"/>
+            <w:shd w:fill="F2F2F2" w:val="clear"/>
+            <w:tcMar>
+              <w:top w:type="dxa" w:w="70"/>
+              <w:left w:type="dxa" w:w="110"/>
+              <w:bottom w:type="dxa" w:w="70"/>
+              <w:right w:type="dxa" w:w="110"/>
+            </w:tcMar>
+            <w:vAlign w:val="center"/>
+          </w:tcPr>
+          <w:p>
+            <w:pPr>
+              <w:spacing w:after="0"/>
+            </w:pPr>
+            <w:r>
+              <w:rPr>
+                <w:b w:val="false"/>
+                <w:bCs w:val="false"/>
+                <w:sz w:val="17"/>
+                <w:szCs w:val="17"/>
+              </w:rPr>
+              <w:t xml:space="preserve">Dependem do Portal da Transparência e de fontes estaduais (fases seguintes)</w:t>
+            </w:r>
+          </w:p>
+        </w:tc>
+      </w:tr>
+      <w:tr>
+        <w:trPr>
+          <w:cantSplit/>
+        </w:trPr>
+        <w:tc>
+          <w:tcPr>
+            <w:tcW w:type="dxa" w:w="2300"/>
+            <w:shd w:fill="FFFFFF" w:val="clear"/>
+            <w:tcMar>
+              <w:top w:type="dxa" w:w="70"/>
+              <w:left w:type="dxa" w:w="110"/>
+              <w:bottom w:type="dxa" w:w="70"/>
+              <w:right w:type="dxa" w:w="110"/>
+            </w:tcMar>
+            <w:vAlign w:val="center"/>
+          </w:tcPr>
+          <w:p>
+            <w:pPr>
+              <w:spacing w:after="0"/>
+            </w:pPr>
+            <w:r>
+              <w:rPr>
+                <w:b w:val="false"/>
+                <w:bCs w:val="false"/>
+                <w:sz w:val="17"/>
+                <w:szCs w:val="17"/>
+              </w:rPr>
+              <w:t xml:space="preserve">Fornecedor</w:t>
+            </w:r>
+          </w:p>
+        </w:tc>
+        <w:tc>
+          <w:tcPr>
+            <w:tcW w:type="dxa" w:w="2700"/>
+            <w:shd w:fill="FFFFFF" w:val="clear"/>
+            <w:tcMar>
+              <w:top w:type="dxa" w:w="70"/>
+              <w:left w:type="dxa" w:w="110"/>
+              <w:bottom w:type="dxa" w:w="70"/>
+              <w:right w:type="dxa" w:w="110"/>
+            </w:tcMar>
+            <w:vAlign w:val="center"/>
+          </w:tcPr>
+          <w:p>
+            <w:pPr>
+              <w:spacing w:after="0"/>
+            </w:pPr>
+            <w:r>
+              <w:rPr>
+                <w:b w:val="false"/>
+                <w:bCs w:val="false"/>
+                <w:sz w:val="17"/>
+                <w:szCs w:val="17"/>
+              </w:rPr>
               <w:t xml:space="preserve">Identificador e documento no resultado e no contrato</w:t>
             </w:r>
           </w:p>
@@ -24297,7 +25237,7 @@
         <w:tc>
           <w:tcPr>
             <w:tcW w:type="dxa" w:w="4600"/>
-            <w:shd w:fill="F2F2F2" w:val="clear"/>
+            <w:shd w:fill="FFFFFF" w:val="clear"/>
             <w:tcMar>
               <w:top w:type="dxa" w:w="70"/>
               <w:left w:type="dxa" w:w="110"/>
@@ -24330,9 +25270,11 @@
         <w:keepLines/>
         <w:spacing w:after="120" w:before="280"/>
       </w:pPr>
+      <w:bookmarkStart w:name="_Toc31" w:id="31"/>
       <w:r>
         <w:t xml:space="preserve">8.2 Identidade determinística</w:t>
       </w:r>
+      <w:bookmarkEnd w:id="31"/>
     </w:p>
     <w:p>
       <w:pPr>
@@ -24983,7 +25925,7 @@
                 <w:sz w:val="18"/>
                 <w:szCs w:val="18"/>
               </w:rPr>
-              <w:t xml:space="preserve">Fornecedor (pessoa jurídica)</w:t>
+              <w:t xml:space="preserve">LinhaDemonstrativo</w:t>
             </w:r>
           </w:p>
         </w:tc>
@@ -25010,7 +25952,7 @@
                 <w:sz w:val="18"/>
                 <w:szCs w:val="18"/>
               </w:rPr>
-              <w:t xml:space="preserve">CNPJ</w:t>
+              <w:t xml:space="preserve">Código IBGE, exercício, período, demonstrativo, anexo, instituição, rótulo, coluna, código da conta e conta (o mesmo código de conta se repete com contas diferentes)</w:t>
             </w:r>
           </w:p>
         </w:tc>
@@ -25042,6 +25984,65 @@
                 <w:sz w:val="18"/>
                 <w:szCs w:val="18"/>
               </w:rPr>
+              <w:t xml:space="preserve">Fornecedor (pessoa jurídica)</w:t>
+            </w:r>
+          </w:p>
+        </w:tc>
+        <w:tc>
+          <w:tcPr>
+            <w:tcW w:type="dxa" w:w="6600"/>
+            <w:shd w:fill="FFFFFF" w:val="clear"/>
+            <w:tcMar>
+              <w:top w:type="dxa" w:w="70"/>
+              <w:left w:type="dxa" w:w="110"/>
+              <w:bottom w:type="dxa" w:w="70"/>
+              <w:right w:type="dxa" w:w="110"/>
+            </w:tcMar>
+            <w:vAlign w:val="center"/>
+          </w:tcPr>
+          <w:p>
+            <w:pPr>
+              <w:spacing w:after="0"/>
+            </w:pPr>
+            <w:r>
+              <w:rPr>
+                <w:b w:val="false"/>
+                <w:bCs w:val="false"/>
+                <w:sz w:val="18"/>
+                <w:szCs w:val="18"/>
+              </w:rPr>
+              <w:t xml:space="preserve">CNPJ</w:t>
+            </w:r>
+          </w:p>
+        </w:tc>
+      </w:tr>
+      <w:tr>
+        <w:trPr>
+          <w:cantSplit/>
+        </w:trPr>
+        <w:tc>
+          <w:tcPr>
+            <w:tcW w:type="dxa" w:w="3000"/>
+            <w:shd w:fill="F2F2F2" w:val="clear"/>
+            <w:tcMar>
+              <w:top w:type="dxa" w:w="70"/>
+              <w:left w:type="dxa" w:w="110"/>
+              <w:bottom w:type="dxa" w:w="70"/>
+              <w:right w:type="dxa" w:w="110"/>
+            </w:tcMar>
+            <w:vAlign w:val="center"/>
+          </w:tcPr>
+          <w:p>
+            <w:pPr>
+              <w:spacing w:after="0"/>
+            </w:pPr>
+            <w:r>
+              <w:rPr>
+                <w:b w:val="false"/>
+                <w:bCs w:val="false"/>
+                <w:sz w:val="18"/>
+                <w:szCs w:val="18"/>
+              </w:rPr>
               <w:t xml:space="preserve">Fornecedor (pessoa física)</w:t>
             </w:r>
           </w:p>
@@ -25049,7 +26050,7 @@
         <w:tc>
           <w:tcPr>
             <w:tcW w:type="dxa" w:w="6600"/>
-            <w:shd w:fill="FFFFFF" w:val="clear"/>
+            <w:shd w:fill="F2F2F2" w:val="clear"/>
             <w:tcMar>
               <w:top w:type="dxa" w:w="70"/>
               <w:left w:type="dxa" w:w="110"/>
@@ -25082,9 +26083,11 @@
         <w:keepLines/>
         <w:spacing w:after="120" w:before="280"/>
       </w:pPr>
+      <w:bookmarkStart w:name="_Toc32" w:id="32"/>
       <w:r>
         <w:t xml:space="preserve">8.3 Divergências registradas</w:t>
       </w:r>
+      <w:bookmarkEnd w:id="32"/>
     </w:p>
     <w:p>
       <w:pPr>
@@ -25158,9 +26161,11 @@
         <w:keepLines/>
         <w:spacing w:after="120" w:before="280"/>
       </w:pPr>
+      <w:bookmarkStart w:name="_Toc33" w:id="33"/>
       <w:r>
         <w:t xml:space="preserve">8.4 Quarentena e marcações de qualidade</w:t>
       </w:r>
+      <w:bookmarkEnd w:id="33"/>
     </w:p>
     <w:p>
       <w:pPr>
@@ -25792,9 +26797,11 @@
         <w:keepLines/>
         <w:spacing w:after="120" w:before="280"/>
       </w:pPr>
+      <w:bookmarkStart w:name="_Toc34" w:id="34"/>
       <w:r>
         <w:t xml:space="preserve">8.5 Armazenamento da silver</w:t>
       </w:r>
+      <w:bookmarkEnd w:id="34"/>
     </w:p>
     <w:p>
       <w:pPr>
@@ -25831,9 +26838,11 @@
         <w:keepLines/>
         <w:spacing w:after="120" w:before="280"/>
       </w:pPr>
+      <w:bookmarkStart w:name="_Toc35" w:id="35"/>
       <w:r>
         <w:t xml:space="preserve">8.6 Banco de domínio (migração 0001)</w:t>
       </w:r>
+      <w:bookmarkEnd w:id="35"/>
     </w:p>
     <w:p>
       <w:pPr>
@@ -26508,6 +27517,21 @@
   <w:style w:type="paragraph" w:styleId="Normal" w:default="1">
     <w:name w:val="Normal"/>
     <w:qFormat/>
+  </w:style>
+  <w:style w:type="table" w:styleId="TableNormal" w:default="true">
+    <w:name w:val="Normal Table"/>
+    <w:uiPriority w:val="99"/>
+    <w:semiHidden/>
+    <w:unhideWhenUsed/>
+    <w:tblPr>
+      <w:tblInd w:type="dxa" w:w="0"/>
+      <w:tblCellMar>
+        <w:top w:type="dxa" w:w="0"/>
+        <w:left w:type="dxa" w:w="108"/>
+        <w:bottom w:type="dxa" w:w="0"/>
+        <w:right w:type="dxa" w:w="108"/>
+      </w:tblCellMar>
+    </w:tblPr>
   </w:style>
   <w:style w:type="paragraph" w:styleId="Title">
     <w:name w:val="Title"/>

</xml_diff>

<commit_message>
Conformidade: despesa por função ao lado do grupo de pares (ADR-041)
O cartão do grupo de pares mostra a despesa por função por habitante do ente,
com a mediana e a metade central do grupo e de que lado dela o ente fica
(RF-PU-05). A fonte é a DCA do último exercício (Anexo I-E), despesa
liquidada sem as intraorçamentárias, dividida pela população do cadastro.
A distribuição só sai com 15 entes do grupo com a DCA lida e somando o total.

Coleta nova no job conformidade (lumen painel despesa-funcao): só quem tem a
DCA no extrato e ainda não está no estado (despesa-funcao-<UF>.json.gz), em
lotes, até 30 minutos por grupo de UFs. Ensaio real com a região Norte: 434
DCA em 9 minutos, todas somando o total ao centavo.

Correção: a resposta da DCA não traz o campo demonstrativo, e a normalização
mandava toda linha para a quarentena; agora ele vem do anexo. Fábricas
siconfi_dca e siconfi_rgf no fluxo. DOC-05 1.4, DOC-06 2.0, DOC-10 1.9,
DOC-13 1.5 e DOC-11 regerados.
</commit_message>
<xml_diff>
--- a/docs/DOC-05_Modelo_de_Dados.docx
+++ b/docs/DOC-05_Modelo_de_Dados.docx
@@ -267,7 +267,7 @@
                 <w:sz w:val="19"/>
                 <w:szCs w:val="19"/>
               </w:rPr>
-              <w:t xml:space="preserve">1.3</w:t>
+              <w:t xml:space="preserve">1.4</w:t>
             </w:r>
           </w:p>
         </w:tc>
@@ -24999,7 +24999,7 @@
                 <w:sz w:val="17"/>
                 <w:szCs w:val="17"/>
               </w:rPr>
-              <w:t xml:space="preserve">Nova: cada linha do RREO, do RGF e da DCA como o Tesouro publica (ente, exercício, período, demonstrativo, anexo, coluna, conta e valor); dela sai a receita corrente líquida do ente, usada no grupo de pares (ADR-038)</w:t>
+              <w:t xml:space="preserve">Nova: cada linha do RREO, do RGF e da DCA como o Tesouro publica (ente, exercício, período, demonstrativo, anexo, coluna, conta e valor); dela saem a receita corrente líquida do ente, usada no grupo de pares (ADR-038), e a despesa por função, comparada com a do grupo (ADR-041); na DCA, que não traz o campo, o demonstrativo vem do anexo</w:t>
             </w:r>
           </w:p>
         </w:tc>

</xml_diff>